<commit_message>
Fix: firma_sello recorte incluye el sello completo (DIOCESIS de S.P.M.)
Regeneradas las cartas firmadas con el sello corregido.

Co-Authored-By: Claude Opus 4.8 <noreply@anthropic.com>
Claude-Session: https://claude.ai/code/session_01MGAmtqoRwx6cYP4Ki2adap
</commit_message>
<xml_diff>
--- a/Carta_Induveca_FIRMADA_ETC88.docx
+++ b/Carta_Induveca_FIRMADA_ETC88.docx
@@ -191,7 +191,7 @@
       <w:r>
         <w:drawing>
           <wp:inline xmlns:a="http://schemas.openxmlformats.org/drawingml/2006/main" xmlns:pic="http://schemas.openxmlformats.org/drawingml/2006/picture">
-            <wp:extent cx="5669280" cy="1556475"/>
+            <wp:extent cx="5669280" cy="1866138"/>
             <wp:docPr id="2" name="Picture 2"/>
             <wp:cNvGraphicFramePr>
               <a:graphicFrameLocks noChangeAspect="1"/>
@@ -212,7 +212,7 @@
                   <pic:spPr>
                     <a:xfrm>
                       <a:off x="0" y="0"/>
-                      <a:ext cx="5669280" cy="1556475"/>
+                      <a:ext cx="5669280" cy="1866138"/>
                     </a:xfrm>
                     <a:prstGeom prst="rect"/>
                   </pic:spPr>

</xml_diff>

<commit_message>
Fix: firma_sello con firma completa de Juan Manuel + sello completo
Recorte ajustado (top 0.710, bottom 0.965): incluye ambas firmas íntegras y el
sello completo, sin la línea 'bendiciones.'. Cartas firmadas regeneradas.

Co-Authored-By: Claude Opus 4.8 <noreply@anthropic.com>
Claude-Session: https://claude.ai/code/session_01MGAmtqoRwx6cYP4Ki2adap
</commit_message>
<xml_diff>
--- a/Carta_Induveca_FIRMADA_ETC88.docx
+++ b/Carta_Induveca_FIRMADA_ETC88.docx
@@ -191,7 +191,7 @@
       <w:r>
         <w:drawing>
           <wp:inline xmlns:a="http://schemas.openxmlformats.org/drawingml/2006/main" xmlns:pic="http://schemas.openxmlformats.org/drawingml/2006/picture">
-            <wp:extent cx="5669280" cy="1866138"/>
+            <wp:extent cx="5669280" cy="1960626"/>
             <wp:docPr id="2" name="Picture 2"/>
             <wp:cNvGraphicFramePr>
               <a:graphicFrameLocks noChangeAspect="1"/>
@@ -212,7 +212,7 @@
                   <pic:spPr>
                     <a:xfrm>
                       <a:off x="0" y="0"/>
-                      <a:ext cx="5669280" cy="1866138"/>
+                      <a:ext cx="5669280" cy="1960626"/>
                     </a:xfrm>
                     <a:prstGeom prst="rect"/>
                   </pic:spPr>

</xml_diff>